<commit_message>
fix: Replace Unicode chars in eval tests for Windows compatibility, update docs and recommendation agent
- Fix UnicodeEncodeError in eval tests by replacing ★ and — with ASCII equivalents
- Update recommendation agent prompts and tools
- Update project documentation and monitoring docs

Co-Authored-By: Claude Opus 4.6 <noreply@anthropic.com>
</commit_message>
<xml_diff>
--- a/docs/SmartShop_AI_Project_Documentation.docx
+++ b/docs/SmartShop_AI_Project_Documentation.docx
@@ -278,7 +278,7 @@
           <w:sz w:val="22"/>
           <w:szCs w:val="22"/>
         </w:rPr>
-        <w:t xml:space="preserve">Build a production-ready system with CI/CD pipelines, cloud deployment, comprehensive testing (430+ tests), and monitoring</w:t>
+        <w:t>Build a production-ready system with CI/CD pipelines, cloud deployment, comprehensive testing (511+ tests), and monitoring</w:t>
       </w:r>
     </w:p>
     <w:p>
@@ -460,7 +460,7 @@
           <w:sz w:val="22"/>
           <w:szCs w:val="22"/>
         </w:rPr>
-        <w:t xml:space="preserve">SmartShop AI demonstrates that multi-agent AI systems can significantly improve e-commerce user experiences. By routing queries to specialized agents, the system delivers more accurate and contextual responses than a single generalist model. The session memory enables natural multi-turn conversations, while the RAG pipeline ensures policy answers are grounded in actual documents rather than hallucinated. The production-ready architecture with 430+ tests, CI/CD, and Azure deployment shows this approach is viable for real-world deployment.</w:t>
+        <w:t>SmartShop AI demonstrates that multi-agent AI systems can significantly improve e-commerce user experiences. By routing queries to specialized agents, the system delivers more accurate and contextual responses than a single generalist model. The session memory enables natural multi-turn conversations, while the RAG pipeline ensures policy answers are grounded in actual documents rather than hallucinated. The production-ready architecture with 511+ tests, CI/CD, and Azure deployment shows this approach is viable for real-world deployment.</w:t>
       </w:r>
     </w:p>
     <w:p>
@@ -2174,7 +2174,7 @@
                 <w:sz w:val="20"/>
                 <w:szCs w:val="20"/>
               </w:rPr>
-              <w:t xml:space="preserve">pytest (430+ tests)</w:t>
+              <w:t>pytest (511+ tests)</w:t>
             </w:r>
           </w:p>
         </w:tc>
@@ -4198,7 +4198,7 @@
           <w:sz w:val="22"/>
           <w:szCs w:val="22"/>
         </w:rPr>
-        <w:t xml:space="preserve">SmartShop AI has been fully implemented and validated across 22 user stories with 430+ passing tests. The multi-agent architecture using pydantic-ai is proven to work effectively with GPT-4o-mini, delivering accurate intent classification and domain-specific responses. The FAISS-based RAG pipeline reliably retrieves relevant policy documents with cosine similarity search.</w:t>
+        <w:t>SmartShop AI has been fully implemented and validated across 29 user stories with 511+ passing tests. The multi-agent architecture using pydantic-ai is proven to work effectively with GPT-4o-mini, delivering accurate intent classification and domain-specific responses. The FAISS-based RAG pipeline reliably retrieves relevant policy documents with cosine similarity search.</w:t>
       </w:r>
     </w:p>
     <w:p>
@@ -4596,6 +4596,118 @@
                 <w:szCs w:val="20"/>
               </w:rPr>
               <w:t xml:space="preserve">GitHub Actions with PostgreSQL and Redis service containers mirrors production environment</w:t>
+            </w:r>
+          </w:p>
+        </w:tc>
+      </w:tr>
+      <w:tr>
+        <w:tc>
+          <w:tcPr>
+            <w:tcW w:type="dxa" w:w="3120"/>
+          </w:tcPr>
+          <w:p>
+            <w:r>
+              <w:rPr>
+                <w:sz w:val="20"/>
+              </w:rPr>
+              <w:t>Agent tool-calling effectiveness</w:t>
+            </w:r>
+          </w:p>
+        </w:tc>
+        <w:tc>
+          <w:tcPr>
+            <w:tcW w:type="dxa" w:w="6240"/>
+          </w:tcPr>
+          <w:p>
+            <w:r>
+              <w:rPr>
+                <w:sz w:val="20"/>
+              </w:rPr>
+              <w:t>Enhanced logging revealed agents not always calling tools correctly. Improved system prompts with explicit tool-calling instructions and added structured output validation to catch tool misuse early</w:t>
+            </w:r>
+          </w:p>
+        </w:tc>
+      </w:tr>
+      <w:tr>
+        <w:tc>
+          <w:tcPr>
+            <w:tcW w:type="dxa" w:w="3120"/>
+          </w:tcPr>
+          <w:p>
+            <w:r>
+              <w:rPr>
+                <w:sz w:val="20"/>
+              </w:rPr>
+              <w:t>Silent error masking</w:t>
+            </w:r>
+          </w:p>
+        </w:tc>
+        <w:tc>
+          <w:tcPr>
+            <w:tcW w:type="dxa" w:w="6240"/>
+          </w:tcPr>
+          <w:p>
+            <w:r>
+              <w:rPr>
+                <w:sz w:val="20"/>
+              </w:rPr>
+              <w:t>GeneralResponseAgent was returning success=True on exceptions, masking failures. SCRUM-69 hardened all error paths — agents now report honest failure states, API endpoints have explicit 503 boundaries, and session parse failures trigger alerting</w:t>
+            </w:r>
+          </w:p>
+        </w:tc>
+      </w:tr>
+      <w:tr>
+        <w:tc>
+          <w:tcPr>
+            <w:tcW w:type="dxa" w:w="3120"/>
+          </w:tcPr>
+          <w:p>
+            <w:r>
+              <w:rPr>
+                <w:sz w:val="20"/>
+              </w:rPr>
+              <w:t>SQL query inefficiency</w:t>
+            </w:r>
+          </w:p>
+        </w:tc>
+        <w:tc>
+          <w:tcPr>
+            <w:tcW w:type="dxa" w:w="6240"/>
+          </w:tcPr>
+          <w:p>
+            <w:r>
+              <w:rPr>
+                <w:sz w:val="20"/>
+              </w:rPr>
+              <w:t>Review stats required 3 separate DB queries. Combined into single aggregation query using CASE expressions. Policy fallback moved from Python filtering to SQL WHERE clauses (SCRUM-67)</w:t>
+            </w:r>
+          </w:p>
+        </w:tc>
+      </w:tr>
+      <w:tr>
+        <w:tc>
+          <w:tcPr>
+            <w:tcW w:type="dxa" w:w="3120"/>
+          </w:tcPr>
+          <w:p>
+            <w:r>
+              <w:rPr>
+                <w:sz w:val="20"/>
+              </w:rPr>
+              <w:t>Agent routing accuracy</w:t>
+            </w:r>
+          </w:p>
+        </w:tc>
+        <w:tc>
+          <w:tcPr>
+            <w:tcW w:type="dxa" w:w="6240"/>
+          </w:tcPr>
+          <w:p>
+            <w:r>
+              <w:rPr>
+                <w:sz w:val="20"/>
+              </w:rPr>
+              <w:t>Low-confidence intent classifications were routed to wrong agents. Added confidence gating (threshold 0.6), hallucination tracking for recommendation IDs, FAISS similarity threshold filtering, and best_deal validation (SCRUM-68)</w:t>
             </w:r>
           </w:p>
         </w:tc>
@@ -6878,6 +6990,48 @@
           </w:p>
         </w:tc>
       </w:tr>
+      <w:tr>
+        <w:tc>
+          <w:tcPr>
+            <w:tcW w:type="dxa" w:w="2000"/>
+          </w:tcPr>
+          <w:p>
+            <w:r>
+              <w:t>Phase 5: Hardening</w:t>
+            </w:r>
+          </w:p>
+        </w:tc>
+        <w:tc>
+          <w:tcPr>
+            <w:tcW w:type="dxa" w:w="1200"/>
+          </w:tcPr>
+          <w:p>
+            <w:r>
+              <w:t>Sprint 5</w:t>
+            </w:r>
+          </w:p>
+        </w:tc>
+        <w:tc>
+          <w:tcPr>
+            <w:tcW w:type="dxa" w:w="2560"/>
+          </w:tcPr>
+          <w:p>
+            <w:r>
+              <w:t>SCRUM-63 to SCRUM-69</w:t>
+            </w:r>
+          </w:p>
+        </w:tc>
+        <w:tc>
+          <w:tcPr>
+            <w:tcW w:type="dxa" w:w="3600"/>
+          </w:tcPr>
+          <w:p>
+            <w:r>
+              <w:t>File logging with rotation, DB health checks, DRY code refactor, SQL query optimization, AI routing accuracy improvements, error handling hardening</w:t>
+            </w:r>
+          </w:p>
+        </w:tc>
+      </w:tr>
     </w:tbl>
     <w:p>
       <w:pPr>
@@ -7188,7 +7342,7 @@
           <w:sz w:val="22"/>
           <w:szCs w:val="22"/>
         </w:rPr>
-        <w:t xml:space="preserve">The project followed an iterative Agile approach with 4 sprints across approximately 4 weeks. Each sprint delivered working, tested features with 10-20 new tests per story. The test count grew from 222 (SCRUM-14) to 430 (SCRUM-64), maintaining consistent quality gates throughout.</w:t>
+        <w:t>The project followed an iterative Agile approach with 5 sprints across approximately 4 weeks. Each sprint delivered working, tested features with 10-20 new tests per story. The test count grew from 222 (SCRUM-14) to 511 (SCRUM-64), maintaining consistent quality gates throughout.</w:t>
       </w:r>
     </w:p>
     <w:p>
@@ -8914,7 +9068,7 @@
           <w:sz w:val="22"/>
           <w:szCs w:val="22"/>
         </w:rPr>
-        <w:t xml:space="preserve">SmartShop AI demonstrates that multi-agent AI architectures can meaningfully improve e-commerce customer experiences. By decomposing the problem into specialized domains and routing queries through an intelligent orchestrator, the system delivers more accurate, contextual, and useful responses than a single generalist chatbot. The production-ready implementation across 22 user stories with 430+ tests validates the feasibility and reliability of this approach.</w:t>
+        <w:t>SmartShop AI demonstrates that multi-agent AI architectures can meaningfully improve e-commerce customer experiences. By decomposing the problem into specialized domains and routing queries through an intelligent orchestrator, the system delivers more accurate, contextual, and useful responses than a single generalist chatbot. The production-ready implementation across 29 user stories with 511+ tests validates the feasibility and reliability of this approach.</w:t>
       </w:r>
     </w:p>
     <w:p>
@@ -9138,7 +9292,7 @@
           <w:sz w:val="22"/>
           <w:szCs w:val="22"/>
         </w:rPr>
-        <w:t xml:space="preserve">Test-first discipline pays off: Growing the test suite 10-20 tests per story (222 to 430) caught regressions early and enabled confident CI/CD automation</w:t>
+        <w:t>Test-first discipline pays off: Growing the test suite 10-20 tests per story (222 to 511) caught regressions early and enabled confident CI/CD automation</w:t>
       </w:r>
     </w:p>
     <w:p>
@@ -9177,6 +9331,82 @@
           <w:szCs w:val="22"/>
         </w:rPr>
         <w:t xml:space="preserve">Dual-backend resilience patterns simplify development: The Redis-to-TTLCache fallback pattern meant developers could work locally without Redis while production used managed Redis</w:t>
+      </w:r>
+    </w:p>
+    <w:p>
+      <w:pPr>
+        <w:pStyle w:val="ListParagraph"/>
+        <w:numPr>
+          <w:ilvl w:val="0"/>
+          <w:numId w:val="2"/>
+        </w:numPr>
+        <w:spacing w:after="80"/>
+      </w:pPr>
+      <w:r>
+        <w:rPr>
+          <w:rFonts w:ascii="Arial" w:cs="Arial" w:eastAsia="Arial" w:hAnsi="Arial"/>
+          <w:color w:val="1E293B"/>
+          <w:sz w:val="22"/>
+          <w:szCs w:val="22"/>
+        </w:rPr>
+        <w:t xml:space="preserve">Logging is the key to improving agent effectiveness: After implementing structured file logging with rotation (SCRUM-63) and DB connectivity logging (SCRUM-65), we discovered agents were not always calling their tools effectively. Some agents had improperly implemented tools, and others were not being prompted correctly to use the right tools. This visibility was transformative — it enabled targeted prompt refinements and tool fixes that significantly improved agent response quality</w:t>
+      </w:r>
+    </w:p>
+    <w:p>
+      <w:pPr>
+        <w:pStyle w:val="ListParagraph"/>
+        <w:numPr>
+          <w:ilvl w:val="0"/>
+          <w:numId w:val="2"/>
+        </w:numPr>
+        <w:spacing w:after="80"/>
+      </w:pPr>
+      <w:r>
+        <w:rPr>
+          <w:rFonts w:ascii="Arial" w:cs="Arial" w:eastAsia="Arial" w:hAnsi="Arial"/>
+          <w:color w:val="1E293B"/>
+          <w:sz w:val="22"/>
+          <w:szCs w:val="22"/>
+        </w:rPr>
+        <w:t xml:space="preserve">Agent costing must be tracked systematically: LLM API costs can spiral without visibility. By combining logging, test coverage, and usage limits (request_limit=15 per agent call), we established guardrails to monitor and control per-agent costs. Testing with TestModel (zero API cost) for unit tests and real LLM calls only for eval tests kept development costs minimal while ensuring quality</w:t>
+      </w:r>
+    </w:p>
+    <w:p>
+      <w:pPr>
+        <w:pStyle w:val="ListParagraph"/>
+        <w:numPr>
+          <w:ilvl w:val="0"/>
+          <w:numId w:val="2"/>
+        </w:numPr>
+        <w:spacing w:after="80"/>
+      </w:pPr>
+      <w:r>
+        <w:rPr>
+          <w:rFonts w:ascii="Arial" w:cs="Arial" w:eastAsia="Arial" w:hAnsi="Arial"/>
+          <w:color w:val="1E293B"/>
+          <w:sz w:val="22"/>
+          <w:szCs w:val="22"/>
+        </w:rPr>
+        <w:t xml:space="preserve">Hardening error handling prevents silent failures: SCRUM-69 revealed that the GeneralResponseAgent was returning success=True even when exceptions occurred, masking real failures from monitoring. Adding honest error reporting, explicit API endpoint error boundaries (503 responses), session parse alerting, and intent classifier failure flags created a much more observable and debuggable system</w:t>
+      </w:r>
+    </w:p>
+    <w:p>
+      <w:pPr>
+        <w:pStyle w:val="ListParagraph"/>
+        <w:numPr>
+          <w:ilvl w:val="0"/>
+          <w:numId w:val="2"/>
+        </w:numPr>
+        <w:spacing w:after="80"/>
+      </w:pPr>
+      <w:r>
+        <w:rPr>
+          <w:rFonts w:ascii="Arial" w:cs="Arial" w:eastAsia="Arial" w:hAnsi="Arial"/>
+          <w:color w:val="1E293B"/>
+          <w:sz w:val="22"/>
+          <w:szCs w:val="22"/>
+        </w:rPr>
+        <w:t xml:space="preserve">DRY refactoring improves maintainability without risk: The SCRUM-66 refactor extracted four duplication patterns (agent error handling, cache factory, product filters, query builders) with zero behaviour change. The existing 460-test suite provided confidence that the refactor introduced no regressions, validating the test-first discipline from earlier sprints</w:t>
       </w:r>
     </w:p>
     <w:sectPr>

</xml_diff>